<commit_message>
Add STL robustness helpers for borrow-overtake safety
</commit_message>
<xml_diff>
--- a/reports/wrapper_validation_report/wrapper_validation_report.docx
+++ b/reports/wrapper_validation_report/wrapper_validation_report.docx
@@ -64,7 +64,7 @@
         <w:pStyle w:val="ListBullet"/>
       </w:pPr>
       <w:r>
-        <w:t>底层项：三组 cost 使用同一批 objective / STL-style violation 函数。</w:t>
+        <w:t>底层项：三组 cost 使用同一批 objective / STL robustness violation 函数。</w:t>
       </w:r>
     </w:p>
     <w:p>
@@ -408,7 +408,7 @@
           </w:tcPr>
           <w:p>
             <w:r>
-              <w:t>81.4</w:t>
+              <w:t>57.9</w:t>
             </w:r>
           </w:p>
         </w:tc>
@@ -418,7 +418,7 @@
           </w:tcPr>
           <w:p>
             <w:r>
-              <w:t>2.71</w:t>
+              <w:t>1.85</w:t>
             </w:r>
           </w:p>
         </w:tc>
@@ -428,7 +428,7 @@
           </w:tcPr>
           <w:p>
             <w:r>
-              <w:t>0.32</w:t>
+              <w:t>0.34</w:t>
             </w:r>
           </w:p>
         </w:tc>
@@ -438,7 +438,7 @@
           </w:tcPr>
           <w:p>
             <w:r>
-              <w:t>16.8</w:t>
+              <w:t>16.9</w:t>
             </w:r>
           </w:p>
         </w:tc>
@@ -448,7 +448,7 @@
           </w:tcPr>
           <w:p>
             <w:r>
-              <w:t>48.0</w:t>
+              <w:t>61.0</w:t>
             </w:r>
           </w:p>
         </w:tc>
@@ -510,7 +510,7 @@
           </w:tcPr>
           <w:p>
             <w:r>
-              <w:t>139.7</w:t>
+              <w:t>164.7</w:t>
             </w:r>
           </w:p>
         </w:tc>
@@ -520,7 +520,7 @@
           </w:tcPr>
           <w:p>
             <w:r>
-              <w:t>4.27</w:t>
+              <w:t>5.01</w:t>
             </w:r>
           </w:p>
         </w:tc>
@@ -530,7 +530,7 @@
           </w:tcPr>
           <w:p>
             <w:r>
-              <w:t>-0.19</w:t>
+              <w:t>-0.50</w:t>
             </w:r>
           </w:p>
         </w:tc>
@@ -540,7 +540,7 @@
           </w:tcPr>
           <w:p>
             <w:r>
-              <w:t>18.0</w:t>
+              <w:t>17.9</w:t>
             </w:r>
           </w:p>
         </w:tc>
@@ -550,7 +550,7 @@
           </w:tcPr>
           <w:p>
             <w:r>
-              <w:t>116.1</w:t>
+              <w:t>124.8</w:t>
             </w:r>
           </w:p>
         </w:tc>
@@ -612,7 +612,7 @@
           </w:tcPr>
           <w:p>
             <w:r>
-              <w:t>81.4</w:t>
+              <w:t>57.9</w:t>
             </w:r>
           </w:p>
         </w:tc>
@@ -622,7 +622,7 @@
           </w:tcPr>
           <w:p>
             <w:r>
-              <w:t>2.71</w:t>
+              <w:t>1.85</w:t>
             </w:r>
           </w:p>
         </w:tc>
@@ -632,7 +632,7 @@
           </w:tcPr>
           <w:p>
             <w:r>
-              <w:t>0.32</w:t>
+              <w:t>0.34</w:t>
             </w:r>
           </w:p>
         </w:tc>
@@ -642,7 +642,7 @@
           </w:tcPr>
           <w:p>
             <w:r>
-              <w:t>16.8</w:t>
+              <w:t>16.9</w:t>
             </w:r>
           </w:p>
         </w:tc>
@@ -652,7 +652,7 @@
           </w:tcPr>
           <w:p>
             <w:r>
-              <w:t>48.0</w:t>
+              <w:t>61.0</w:t>
             </w:r>
           </w:p>
         </w:tc>
@@ -714,7 +714,7 @@
           </w:tcPr>
           <w:p>
             <w:r>
-              <w:t>148.0</w:t>
+              <w:t>174.7</w:t>
             </w:r>
           </w:p>
         </w:tc>
@@ -724,7 +724,7 @@
           </w:tcPr>
           <w:p>
             <w:r>
-              <w:t>5.60</w:t>
+              <w:t>6.21</w:t>
             </w:r>
           </w:p>
         </w:tc>
@@ -734,7 +734,7 @@
           </w:tcPr>
           <w:p>
             <w:r>
-              <w:t>0.33</w:t>
+              <w:t>0.44</w:t>
             </w:r>
           </w:p>
         </w:tc>
@@ -744,7 +744,7 @@
           </w:tcPr>
           <w:p>
             <w:r>
-              <w:t>10.4</w:t>
+              <w:t>10.5</w:t>
             </w:r>
           </w:p>
         </w:tc>
@@ -754,7 +754,7 @@
           </w:tcPr>
           <w:p>
             <w:r>
-              <w:t>-24.5</w:t>
+              <w:t>-25.4</w:t>
             </w:r>
           </w:p>
         </w:tc>
@@ -836,7 +836,7 @@
           </w:tcPr>
           <w:p>
             <w:r>
-              <w:t>0.14</w:t>
+              <w:t>-0.26</w:t>
             </w:r>
           </w:p>
         </w:tc>
@@ -846,7 +846,7 @@
           </w:tcPr>
           <w:p>
             <w:r>
-              <w:t>9.8</w:t>
+              <w:t>10.5</w:t>
             </w:r>
           </w:p>
         </w:tc>
@@ -856,7 +856,7 @@
           </w:tcPr>
           <w:p>
             <w:r>
-              <w:t>-14.7</w:t>
+              <w:t>-14.3</w:t>
             </w:r>
           </w:p>
         </w:tc>
@@ -918,7 +918,7 @@
           </w:tcPr>
           <w:p>
             <w:r>
-              <w:t>148.0</w:t>
+              <w:t>174.7</w:t>
             </w:r>
           </w:p>
         </w:tc>
@@ -928,7 +928,7 @@
           </w:tcPr>
           <w:p>
             <w:r>
-              <w:t>5.60</w:t>
+              <w:t>6.21</w:t>
             </w:r>
           </w:p>
         </w:tc>
@@ -938,7 +938,7 @@
           </w:tcPr>
           <w:p>
             <w:r>
-              <w:t>0.33</w:t>
+              <w:t>0.44</w:t>
             </w:r>
           </w:p>
         </w:tc>
@@ -948,7 +948,7 @@
           </w:tcPr>
           <w:p>
             <w:r>
-              <w:t>10.4</w:t>
+              <w:t>10.5</w:t>
             </w:r>
           </w:p>
         </w:tc>
@@ -958,7 +958,7 @@
           </w:tcPr>
           <w:p>
             <w:r>
-              <w:t>-24.5</w:t>
+              <w:t>-25.4</w:t>
             </w:r>
           </w:p>
         </w:tc>
@@ -1020,7 +1020,7 @@
           </w:tcPr>
           <w:p>
             <w:r>
-              <w:t>232.6</w:t>
+              <w:t>234.0</w:t>
             </w:r>
           </w:p>
         </w:tc>
@@ -1030,7 +1030,7 @@
           </w:tcPr>
           <w:p>
             <w:r>
-              <w:t>9.92</w:t>
+              <w:t>10.44</w:t>
             </w:r>
           </w:p>
         </w:tc>
@@ -1040,7 +1040,7 @@
           </w:tcPr>
           <w:p>
             <w:r>
-              <w:t>-0.55</w:t>
+              <w:t>-0.17</w:t>
             </w:r>
           </w:p>
         </w:tc>
@@ -1050,7 +1050,7 @@
           </w:tcPr>
           <w:p>
             <w:r>
-              <w:t>8.6</w:t>
+              <w:t>9.5</w:t>
             </w:r>
           </w:p>
         </w:tc>
@@ -1060,7 +1060,7 @@
           </w:tcPr>
           <w:p>
             <w:r>
-              <w:t>-26.0</w:t>
+              <w:t>-26.1</w:t>
             </w:r>
           </w:p>
         </w:tc>
@@ -1122,7 +1122,7 @@
           </w:tcPr>
           <w:p>
             <w:r>
-              <w:t>-74.8</w:t>
+              <w:t>-16.9</w:t>
             </w:r>
           </w:p>
         </w:tc>
@@ -1132,7 +1132,7 @@
           </w:tcPr>
           <w:p>
             <w:r>
-              <w:t>-2.20</w:t>
+              <w:t>-0.50</w:t>
             </w:r>
           </w:p>
         </w:tc>
@@ -1142,7 +1142,7 @@
           </w:tcPr>
           <w:p>
             <w:r>
-              <w:t>0.28</w:t>
+              <w:t>-0.06</w:t>
             </w:r>
           </w:p>
         </w:tc>
@@ -1152,7 +1152,7 @@
           </w:tcPr>
           <w:p>
             <w:r>
-              <w:t>17.9</w:t>
+              <w:t>18.1</w:t>
             </w:r>
           </w:p>
         </w:tc>
@@ -1162,7 +1162,7 @@
           </w:tcPr>
           <w:p>
             <w:r>
-              <w:t>109.8</w:t>
+              <w:t>119.7</w:t>
             </w:r>
           </w:p>
         </w:tc>
@@ -1224,7 +1224,7 @@
           </w:tcPr>
           <w:p>
             <w:r>
-              <w:t>232.6</w:t>
+              <w:t>234.0</w:t>
             </w:r>
           </w:p>
         </w:tc>
@@ -1234,7 +1234,7 @@
           </w:tcPr>
           <w:p>
             <w:r>
-              <w:t>9.92</w:t>
+              <w:t>10.44</w:t>
             </w:r>
           </w:p>
         </w:tc>
@@ -1244,7 +1244,7 @@
           </w:tcPr>
           <w:p>
             <w:r>
-              <w:t>-0.55</w:t>
+              <w:t>-0.17</w:t>
             </w:r>
           </w:p>
         </w:tc>
@@ -1254,7 +1254,7 @@
           </w:tcPr>
           <w:p>
             <w:r>
-              <w:t>8.6</w:t>
+              <w:t>9.5</w:t>
             </w:r>
           </w:p>
         </w:tc>
@@ -1264,7 +1264,7 @@
           </w:tcPr>
           <w:p>
             <w:r>
-              <w:t>-26.0</w:t>
+              <w:t>-26.1</w:t>
             </w:r>
           </w:p>
         </w:tc>
@@ -1345,7 +1345,7 @@
       <w:r>
         <w:drawing>
           <wp:inline xmlns:a="http://schemas.openxmlformats.org/drawingml/2006/main" xmlns:pic="http://schemas.openxmlformats.org/drawingml/2006/picture">
-            <wp:extent cx="6126480" cy="3812032"/>
+            <wp:extent cx="6126480" cy="3866449"/>
             <wp:docPr id="2" name="Picture 2"/>
             <wp:cNvGraphicFramePr>
               <a:graphicFrameLocks noChangeAspect="1"/>
@@ -1366,7 +1366,7 @@
                   <pic:spPr>
                     <a:xfrm>
                       <a:off x="0" y="0"/>
-                      <a:ext cx="6126480" cy="3812032"/>
+                      <a:ext cx="6126480" cy="3866449"/>
                     </a:xfrm>
                     <a:prstGeom prst="rect"/>
                   </pic:spPr>
@@ -1442,7 +1442,7 @@
         <w:pStyle w:val="ListBullet"/>
       </w:pPr>
       <w:r>
-        <w:t>safe: D:\claude_workspace1\IOC_AGV-main\IOC_AGV-main\figures\mgigo_borrow_overtake_safe.mp4</w:t>
+        <w:t>safe: D:\claude_workspace1\igo\figures\mgigo_borrow_overtake_safe.mp4</w:t>
       </w:r>
     </w:p>
     <w:p>
@@ -1450,7 +1450,7 @@
         <w:pStyle w:val="ListBullet"/>
       </w:pPr>
       <w:r>
-        <w:t>blocked: D:\claude_workspace1\IOC_AGV-main\IOC_AGV-main\figures\mgigo_borrow_overtake_blocked.mp4</w:t>
+        <w:t>blocked: D:\claude_workspace1\igo\figures\mgigo_borrow_overtake_blocked.mp4</w:t>
       </w:r>
     </w:p>
     <w:p>
@@ -1458,7 +1458,7 @@
         <w:pStyle w:val="ListBullet"/>
       </w:pPr>
       <w:r>
-        <w:t>critical: D:\claude_workspace1\IOC_AGV-main\IOC_AGV-main\figures\mgigo_borrow_overtake_critical.mp4</w:t>
+        <w:t>critical: D:\claude_workspace1\igo\figures\mgigo_borrow_overtake_critical.mp4</w:t>
       </w:r>
     </w:p>
     <w:p>

</xml_diff>